<commit_message>
fix frontend error image
</commit_message>
<xml_diff>
--- a/VuHoangChinh-2122110380.docx
+++ b/VuHoangChinh-2122110380.docx
@@ -41294,7 +41294,7 @@
       </w:pPr>
       <w:r/>
       <w:r>
-        <w:t>Về cơ chế xử lý hình ảnh, hệ thống cung cấp giải pháp linh hoạt bao gồm cả tải ảnh tĩnh vật lý lên máy chủ và lưu trữ trực tiếp chuỗi Base64 vào cơ sở dữ liệu.</w:t>
+        <w:t>Về cơ chế xử lý hình ảnh, hệ thống cung cấp giải pháp linh hoạt bao gồm cả tải ảnh tĩnh vật lý lên máy chủ và lưu trữ trực tiếp chuỗi Base64 vào cơ sở dữ liệu. Với cơ chế lưu trữ Base64, Frontend chuyển đổi tệp ảnh thành chuỗi Base64 mã hóa ký tự thô và gửi trực tiếp trong chuỗi JSON của request API, lưu vào cột LONGTEXT trong MySQL.</w:t>
       </w:r>
     </w:p>
     <w:p>
@@ -41303,7 +41303,7 @@
       </w:pPr>
       <w:r/>
       <w:r>
-        <w:t>Với cơ chế tải ảnh vật lý, FileUploadController.java tiếp nhận tệp tin từ yêu cầu Multipart. Tên file được đổi ngẫu nhiên bằng chuỗi UUID để tránh trùng lặp, sau đó được lưu trực tiếp vào thư mục tĩnh src/main/resources/static/image trên server và trả về đường dẫn tương đối để lưu vào DB.</w:t>
+        <w:t>Với cơ chế tải ảnh vật lý, FileUploadController.java tiếp nhận tệp tin từ yêu cầu Multipart. Nhằm tối ưu hóa khả năng vận hành trên các môi trường chạy khác nhau, hệ thống giải quyết động đường dẫn lưu trữ thông qua thuộc tính 'user.dir' của Java System. Nếu ứng dụng được khởi chạy từ thư mục gốc của toàn bộ workspace (chứa dự án Spring Boot con), hệ thống sẽ tự động phát hiện và ghi tệp vào đúng thư mục con 'vuhoangchinh/src/main/resources/static/image', tránh việc sinh thư mục rác ngoài cấu trúc mã nguồn.</w:t>
       </w:r>
     </w:p>
     <w:p>
@@ -41312,16 +41312,7 @@
       </w:pPr>
       <w:r/>
       <w:r>
-        <w:t>Với cơ chế lưu trữ Base64, Frontend chuyển đổi tệp ảnh thành chuỗi Base64 mã hóa ký tự thô và gửi trực tiếp trong chuỗi JSON của request API. Cột thumbnail trong bảng products được cấu hình kiểu LONGTEXT giúp lưu trữ toàn vẹn chuỗi Base64 dung lượng lớn trong MySQL.</w:t>
-      </w:r>
-    </w:p>
-    <w:p>
-      <w:pPr>
-        <w:jc w:val="both"/>
-      </w:pPr>
-      <w:r/>
-      <w:r>
-        <w:t>Giải pháp lưu trữ Base64 giúp toàn bộ dữ liệu hình ảnh được chứa tự động (Self-Contained) trong cơ sở dữ liệu MySQL, đơn giản hóa việc triển khai hệ thống mà không cần phụ thuộc vào cấu hình lưu trữ ngoài hay dịch vụ đám mây.</w:t>
+        <w:t>Bên cạnh đó, do classpath của Spring Boot chỉ cập nhật tệp tin tĩnh khi biên dịch lại dự án, ảnh mới tải lên sẽ không thể truy cập ngay lập tức. Để giải quyết triệt để lỗi này, lớp WebConfig.java (triển khai WebMvcConfigurer) được xây dựng để cấu hình bổ sung một Resource Handler vật lý. Cơ chế này ánh xạ trực tiếp đường dẫn URL ảo '/image/**' tới thư mục lưu trữ ảnh vật lý thực tế trên đĩa cứng tại thời điểm thực thi (runtime). Nhờ vậy, hình ảnh của sản phẩm hoặc bài viết sau khi được upload thành công sẽ hiển thị ngay lập tức trên giao diện mà không cần khởi động lại máy chủ Spring Boot.</w:t>
       </w:r>
     </w:p>
     <w:p>
@@ -41429,7 +41420,7 @@
       </w:pPr>
       <w:r/>
       <w:r>
-        <w:t>Do kiến trúc hệ thống được thiết kế tách biệt hoàn toàn, Backend Spring Boot chạy độc lập tại cổng 8080 trong khi hai ứng dụng Frontend ReactJS chạy tại cổng 5173 (Client Storefront) và cổng 5174 (Admin Dashboard). Theo chính sách bảo mật nguồn gốc của trình duyệt (Same-Origin Policy), các yêu cầu mạng AJAX xuyên nguồn gốc sẽ bị chặn lại.</w:t>
+        <w:t>Do kiến trúc hệ thống được thiết kế tách biệt hoàn toàn, Backend Spring Boot chạy độc lập tại cổng 8080 trong khi hai ứng dụng Frontend ReactJS chạy tại cổng 5173 (Client Storefront) và cổng 5174 (Admin Dashboard). Theo chính sách bảo mật nguồn gốc của trình duyệt (Same-Origin Policy), các yêu cầu mạng AJAX xuyên nguồn gốc sẽ bị chặn lại và gây ra lỗi 'Failed to fetch' nghiêm trọng trên bảng điều khiển.</w:t>
       </w:r>
     </w:p>
     <w:p>
@@ -41438,7 +41429,7 @@
       </w:pPr>
       <w:r/>
       <w:r>
-        <w:t>Để giải quyết vấn đề giao tiếp xuyên cổng này, chính sách CORS (Cross-Origin Resource Sharing) được cấu hình rõ ràng trong SecurityConfig.java của Spring Boot.</w:t>
+        <w:t>Để giải quyết vấn đề giao tiếp xuyên cổng này, chính sách CORS (Cross-Origin Resource Sharing) được cấu hình rõ ràng trong Spring Security thông qua lớp SecurityConfig.java. Thay vì chỉ sử dụng chú thích @CrossOrigin đơn lẻ ở tầng Controller dễ bị bỏ qua bởi chuỗi bộ lọc an ninh, hệ thống khai báo một Bean cấu hình CORS tập trung là CorsConfigurationSource.</w:t>
       </w:r>
     </w:p>
     <w:p>
@@ -41447,7 +41438,7 @@
       </w:pPr>
       <w:r/>
       <w:r>
-        <w:t>Hệ thống định nghĩa các quy tắc CORS cho phép chấp nhận các yêu cầu HTTP từ các địa chỉ Client được chỉ định, hỗ trợ đầy đủ các phương thức HTTP chuẩn (GET, POST, PUT, DELETE, OPTIONS).</w:t>
+        <w:t>Bean cấu hình này chỉ định rõ các quy tắc CORS cho phép chấp nhận các yêu cầu HTTP từ các cổng của Client (localhost:5173 và localhost:5174), hỗ trợ đầy đủ các phương thức HTTP chuẩn (GET, POST, PUT, DELETE, OPTIONS). Cấu hình CORS cũng cho phép truyền nhận đầy đủ các thông tin tiêu đề (Headers) cần thiết như Authorization (chứa JWT Token) và Content-Type, đảm bảo các yêu cầu xác thực bất đồng bộ được thực thi an toàn.</w:t>
       </w:r>
     </w:p>
     <w:p>
@@ -41456,16 +41447,7 @@
       </w:pPr>
       <w:r/>
       <w:r>
-        <w:t>Cấu hình CORS cũng cho phép truyền nhận đầy đủ các thông tin tiêu đề (Headers) cần thiết như Authorization (chứa JWT Token) và Content-Type, đảm bảo Frontend ReactJS có thể gửi các yêu cầu bất đồng bộ một cách an toàn.</w:t>
-      </w:r>
-    </w:p>
-    <w:p>
-      <w:pPr>
-        <w:jc w:val="both"/>
-      </w:pPr>
-      <w:r/>
-      <w:r>
-        <w:t>Nhờ thiết lập CORS chính xác, các cuộc gọi API từ Axios Client phía Frontend được thực thi thành công, giúp dữ liệu hiển thị mượt mà trên trình duyệt của người dùng.</w:t>
+        <w:t>Đặc biệt, việc tích hợp cấu hình CORS trực tiếp vào HttpSecurity configuration (.cors(cors -&gt; cors.configurationSource(...))) giúp hệ thống chấp nhận hợp lệ các yêu cầu tiền kiểm preflight (OPTIONS request) từ trình duyệt trước mỗi request chính. Nhờ thiết lập này, lỗi nghẽn kết nối và lỗi đăng nhập 'Failed to fetch' được khắc phục hoàn toàn, giúp luồng truyền tải dữ liệu đơn hàng và xác thực diễn ra thông suốt.</w:t>
       </w:r>
     </w:p>
     <w:p>
@@ -41672,7 +41654,7 @@
       </w:pPr>
       <w:r/>
       <w:r>
-        <w:t>Chức năng quản lý đơn hàng cho phép nhân viên cập nhật tiến trình đơn hàng (Chờ duyệt -&gt; Đang giao -&gt; Đã giao -&gt; Hủy đơn). Khi trạng thái đơn hàng thay đổi, Backend tự động cộng/trừ số lượng tồn kho tương ứng của các biến thể sản phẩm.</w:t>
+        <w:t>Chức năng quản lý đơn hàng cho phép nhân viên cập nhật tiến trình đơn hàng (Chờ duyệt -&gt; Đang giao -&gt; Đã giao -&gt; Hủy đơn). Nhằm đảm bảo tính toàn vẹn dữ liệu đơn hàng, hàm ánh xạ mapOrderFromBackend trên giao diện Admin đã được tối ưu hóa để đồng bộ hóa cả hai trường thông tin người nhận: recipientName (Tên người nhận) và recipientPhone (Số điện thoại người nhận). Việc cải tiến này ngăn chặn việc gửi yêu cầu cập nhật trạng thái đơn hàng làm ghi đè hoặc làm trống dữ liệu giao nhận trên database. Giao diện chi tiết hóa đơn (OrderDetailModal) cũng được thiết kế lại để hiển thị trực quan thông tin liên lạc người nhận thực tế, mang lại hiệu quả quản lý cao cho nhân viên vận hành.</w:t>
       </w:r>
     </w:p>
     <w:p>
@@ -43426,18 +43408,21 @@
     </w:p>
     <w:p>
       <w:pPr/>
+      <w:r/>
       <w:r>
         <w:t>Để đánh giá tính an toàn và khả năng bảo mật của hệ thống quản trị, sinh viên tiến hành kiểm thử hộp đen (Black-box testing) chức năng phân quyền truy cập động giữa hai vai trò nhân viên cốt lõi: ROLE_ADMIN (Quản trị viên toàn quyền) và ROLE_EDITOR (Biên tập viên nội dung).</w:t>
       </w:r>
     </w:p>
     <w:p>
       <w:pPr/>
+      <w:r/>
       <w:r>
         <w:t>Quy trình kiểm thử vai trò Editor: Sử dụng tài khoản nhân viên được gán vai trò ROLE_EDITOR đăng nhập vào hệ thống Admin Dashboard. Nhân viên truy cập thành công các trang quản lý sản phẩm, danh mục sản phẩm và bài viết tin tức. Tuy nhiên, trên Menu điều hướng, các liên kết đến trang quản lý nhân sự (/users) và quản lý vai trò (/roles) bị ẩn đi hoàn toàn. Khi biên tập viên cố tình gõ trực tiếp URL trên thanh địa chỉ trình duyệt, bộ định tuyến Route Guard của React lập tức chặn yêu cầu và chuyển hướng về trang cảnh báo Access Denied. Đồng thời, nếu gửi yêu cầu API trực tiếp bằng công cụ bên ngoài, Spring Security phía Backend sẽ kiểm tra JWT Token, phát hiện không có quyền và trả về mã lỗi HTTP 403 Forbidden.</w:t>
       </w:r>
     </w:p>
     <w:p>
       <w:pPr/>
+      <w:r/>
       <w:r>
         <w:t>Quy trình kiểm thử vai trò Admin: Đăng nhập bằng tài khoản admin mặc định. Quản trị viên truy cập bình thường tất cả các trang chức năng, thực hiện CRUD nhân sự và chỉnh sửa vai trò nhân viên thành công. Hệ thống cũng thực thi quy tắc chống khóa (Anti-Lockout): Admin không được tự xóa tài khoản của chính mình hoặc tự hạ quyền bản thân, nếu thực hiện hệ thống sẽ hiển thị cảnh báo lỗi màu đỏ trực quan.</w:t>
       </w:r>
@@ -43559,20 +43544,23 @@
     </w:p>
     <w:p>
       <w:pPr/>
+      <w:r/>
       <w:r>
         <w:t>Nghiệp vụ thanh toán đặt hàng và đồng bộ số lượng sản phẩm được kiểm thử tích hợp (Integration testing) để xác minh tính nhất quán dữ liệu và tính toàn vẹn của database transaction.</w:t>
       </w:r>
     </w:p>
     <w:p>
       <w:pPr/>
+      <w:r/>
       <w:r>
         <w:t>Kiểm thử điều kiện biên với lỗi vượt giới hạn tồn kho: Giả sử sản phẩm giày Nike Jordan 2PF trong database chỉ còn tồn kho 2 đôi. Khách hàng thêm sản phẩm này vào giỏ hàng với số lượng 3 đôi và tiến hành điền thông tin thanh toán. Khi khách hàng bấm xác nhận đặt hàng, client gửi yêu cầu POST đến API. Backend Spring Boot mở một database transaction để kiểm tra số lượng đặt với tồn kho của biến thể sản phẩm. Phát hiện số lượng đặt (3) lớn hơn tồn kho (2), Backend lập tức thực hiện Rollback transaction (không tạo đơn hàng, không trừ kho) và phản hồi mã lỗi HTTP 400 Bad Request kèm thông báo lỗi chi tiết. Frontend ReactJS nhận mã lỗi này, hiển thị hộp thoại cảnh báo màu đỏ trực quan yêu cầu khách hàng cập nhật lại số lượng giỏ hàng.</w:t>
       </w:r>
     </w:p>
     <w:p>
       <w:pPr/>
-      <w:r>
-        <w:t>Kiểm thử luồng đặt hàng thành công: Khách hàng giảm số lượng mua giày Jordan xuống 1 đôi và nhấn đặt hàng. Backend kiểm duyệt thành công, thực hiện trừ tồn kho sản phẩm đi 1 (tồn kho mới cập nhật là 1), ghi nhận đơn hàng và chi tiết đơn hàng vào MySQL, đồng thời gửi email thông báo hóa đơn thành công. Client nhận phản hồi HTTP 200 OK, tự động xóa sạch giỏ hàng trong localStorage và chuyển tiếp khách hàng sang giao diện hoàn tất đơn hàng.</w:t>
+      <w:r/>
+      <w:r>
+        <w:t>Kiểm thử luồng đặt hàng và cập nhật đơn hàng thành công: Khách hàng giảm số lượng mua giày Jordan xuống 1 đôi và nhấn đặt hàng. Backend kiểm duyệt thành công, thực hiện trừ tồn kho sản phẩm đi 1 (tồn kho mới cập nhật là 1), ghi nhận đơn hàng và chi tiết đơn hàng vào MySQL. Khi nhân viên truy cập Admin Dashboard để cập nhật trạng thái đơn hàng sang 'Đang giao' hoặc 'Đã giao', yêu cầu PUT được gửi lên Backend với đầy đủ thông tin người nhận đã được ánh xạ (recipientName và recipientPhone), đảm bảo thông tin hóa đơn lưu trữ trong cơ sở dữ liệu luôn chính xác và không bị thay đổi bởi dữ liệu mặc định.</w:t>
       </w:r>
     </w:p>
     <w:p>
@@ -43676,24 +43664,28 @@
     </w:p>
     <w:p>
       <w:pPr/>
+      <w:r/>
       <w:r>
         <w:t>Kiểm thử phi chức năng được thực hiện bằng cách giám sát hiệu năng mạng, các cuộc gọi API ngầm và tính tương thích thông qua Trình duyệt Chrome Developer Tools (F12) và Swagger UI.</w:t>
       </w:r>
     </w:p>
     <w:p>
       <w:pPr/>
-      <w:r>
-        <w:t>Giám sát hiệu năng cuộc gọi API: Khi tương tác trên Frontend ReactJS, các yêu cầu HTTP API (như tải danh sách sản phẩm, chi tiết sản phẩm) được gửi đến Backend Spring Boot và phản hồi cực nhanh (chỉ từ 15ms đến 45ms). Hiệu năng đạt được nhờ việc tối ưu hóa cấu trúc cơ sở dữ liệu MySQL và viết các câu lệnh truy vấn JPA bất đồng bộ (Asynchronous) tối ưu. Giao diện tải trang mượt mà, không gặp hiện tượng nghẽn mạng.</w:t>
+      <w:r/>
+      <w:r>
+        <w:t>Giám sát hiệu năng cuộc gọi API và CORS: Khi tương tác trên Frontend ReactJS, các yêu cầu HTTP API được gửi đến Backend Spring Boot và nhận phản hồi cực nhanh (chỉ từ 15ms đến 45ms). Tại tab Network của F12, các yêu cầu preflight (OPTIONS) được ghi nhận nhận mã trạng thái 200 OK thành công từ Spring Security CORS Configuration, cho phép các yêu cầu GET/POST/PUT chính thức được thực hiện mượt mà mà không có bất kỳ cảnh báo lỗi chặn kết nối nào.</w:t>
       </w:r>
     </w:p>
     <w:p>
       <w:pPr/>
-      <w:r>
-        <w:t>Giám sát lỗi Console: Tab Console của F12 được theo dõi kỹ lưỡng xuyên suốt quá trình kiểm thử luồng nghiệp vụ. Kết quả hoàn toàn sạch sẽ, không phát sinh bất kỳ lỗi JavaScript runtime nào hay cảnh báo rò rỉ bộ nhớ (memory leaks), xác minh mã nguồn Frontend được tối ưu hóa tốt.</w:t>
+      <w:r/>
+      <w:r>
+        <w:t>Giám sát lỗi Console và Upload ảnh: Tab Console của F12 được theo dõi kỹ lưỡng xuyên suốt quá trình kiểm thử tải lên hình ảnh sản phẩm. Ảnh tải lên qua FileUploadController được ghi nhận lưu trực tiếp trên máy chủ và lập tức hiển thị trên giao diện của cả trang chủ lẫn trang quản trị nhờ Resource Handler ảo trong WebConfig, không xảy ra hiện tượng vỡ hình (broken image) hay trả về mã lỗi 404.</w:t>
       </w:r>
     </w:p>
     <w:p>
       <w:pPr/>
+      <w:r/>
       <w:r>
         <w:t>Thử nghiệm trực quan qua Swagger UI: Khi truy cập địa chỉ http://localhost:8080/swagger-ui/index.html, giao diện Swagger UI liệt kê đầy đủ danh sách các controllers, các API endpoints và cấu trúc dữ liệu JSON. Thực hiện gửi yêu cầu đăng nhập trực tiếp trên Swagger, Backend phản hồi kết quả JWT Token chính xác, hỗ trợ đắc lực cho công tác debug nhanh.</w:t>
       </w:r>
@@ -43804,18 +43796,21 @@
     </w:p>
     <w:p>
       <w:pPr/>
+      <w:r/>
       <w:r>
         <w:t>Dựa trên kết quả thử nghiệm thực tế và quá trình vận hành hệ thống, sinh viên rút ra các đánh giá khách quan về giải pháp thiết kế:</w:t>
       </w:r>
     </w:p>
     <w:p>
       <w:pPr/>
+      <w:r/>
       <w:r>
         <w:t>Ưu điểm nổi bật: Kiến trúc tách biệt hoàn toàn giữa Frontend (ReactJS) và Backend (Spring Boot Web API) mang lại hiệu năng cao, giảm tải cho server và dễ dàng bảo trì, mở rộng độc lập các phân hệ. Hệ thống bảo mật an toàn nhờ băm mật khẩu một chiều BCrypt, cơ chế Stateless JWT Token và phân quyền động dựa trên vai trò (RBAC) chặt chẽ. CSDL thiết kế chuẩn hóa giúp đảm bảo tính toàn vẹn tham chiếu. Hỗ trợ cơ chế tự động Seed Data và tự động cấu hình kiểu cột hình ảnh LONGTEXT linh hoạt.</w:t>
       </w:r>
     </w:p>
     <w:p>
       <w:pPr/>
+      <w:r/>
       <w:r>
         <w:t>Nhược điểm tồn tại: Trạng thái giỏ hàng lưu ở LocalStorage nên sẽ bị mất nếu người dùng xóa dữ liệu duyệt web hoặc đổi thiết bị. Hệ thống thanh toán chỉ hỗ trợ COD, chưa kết nối trực tiếp các cổng thanh toán online. Chưa triển khai hàng gửi email tự động chạy ngầm (Asynchronous Background Job) dẫn đến thời gian phản hồi API đặt hàng bị kéo dài nhẹ do tiến trình gửi email SMTP đồng bộ.</w:t>
       </w:r>
@@ -43929,18 +43924,21 @@
     </w:p>
     <w:p>
       <w:pPr/>
+      <w:r/>
       <w:r>
         <w:t>Sau quá trình nghiên cứu, thiết kế và hoàn thiện đồ án xây dựng hệ thống quản trị nội dung kết hợp bán hàng Chinh Hoops, sinh viên đã gặt hái được những kết quả quan trọng về kiến thức chuyên môn và kỹ năng thực hành phần mềm.</w:t>
       </w:r>
     </w:p>
     <w:p>
       <w:pPr/>
+      <w:r/>
       <w:r>
         <w:t>Về kiến thức chuyên môn: Nắm vững quy trình thiết kế cơ sở dữ liệu quan hệ chuẩn hóa trên MySQL, làm chủ công nghệ ánh xạ Hibernate JPA và cơ chế di trú kiểu cột dữ liệu động. Hiểu sâu sắc kiến trúc Spring Boot RESTful API, thiết lập bộ lọc Spring Security để bảo vệ API và phân quyền RBAC chặt chẽ. Thành thạo lập trình ứng dụng một trang (SPA) bằng ReactJS kết hợp Vite, Tailwind CSS, điều hướng định tuyến react-router-dom và gọi API bất đồng bộ bằng Axios.</w:t>
       </w:r>
     </w:p>
     <w:p>
       <w:pPr/>
+      <w:r/>
       <w:r>
         <w:t>Về kỹ năng thực hành: Củng cố kỹ năng gỡ lỗi full-stack, phân tích hiệu năng mạng qua F12 Developer Tools và tài liệu hóa API bằng Swagger UI. Đồng thời rèn luyện tư duy giải quyết các bài toán nghiệp vụ phức tạp như đồng bộ tồn kho, transaction rollback và ràng buộc bảo vệ admin panel.</w:t>
       </w:r>
@@ -44094,30 +44092,35 @@
     </w:p>
     <w:p>
       <w:pPr/>
+      <w:r/>
       <w:r>
         <w:t>Để khắc phục các nhược điểm hiện tại và phát triển hệ thống bán giày Chinh Hoops thành một giải pháp thương mại điện tử chuyên nghiệp cấp doanh nghiệp, định hướng nâng cấp trong tương lai sẽ tập trung vào các mục tiêu sau:</w:t>
       </w:r>
     </w:p>
     <w:p>
       <w:pPr/>
+      <w:r/>
       <w:r>
         <w:t>Một là, tích hợp cổng thanh toán trực tuyến: Kết nối các cổng thanh toán điện tử uy tín tại Việt Nam như VNPay, MoMo, ZaloPay hoặc cổng quốc tế Paypal, Stripe để đa dạng hóa phương thức thanh toán cho khách hàng.</w:t>
       </w:r>
     </w:p>
     <w:p>
       <w:pPr/>
+      <w:r/>
       <w:r>
         <w:t>Hai là, đồng bộ hóa giỏ hàng phía máy chủ: Lưu trữ giỏ hàng trong cơ sở dữ liệu thay vì LocalStorage để duy trì giỏ hàng của khách hàng đồng bộ trên mọi thiết bị đăng nhập.</w:t>
       </w:r>
     </w:p>
     <w:p>
       <w:pPr/>
+      <w:r/>
       <w:r>
         <w:t>Ba là, triển khai hàng đợi gửi email bất đồng bộ: Sử dụng Spring Boot `@Async` hoặc RabbitMQ/Kafka để xử lý gửi email xác nhận đơn hàng chạy ngầm, tránh gây nghẽn tiến trình xử lý checkout chính của API.</w:t>
       </w:r>
     </w:p>
     <w:p>
       <w:pPr/>
+      <w:r/>
       <w:r>
         <w:t>Bốn là, áp dụng trí tuệ nhân tạo (AI): Xây dựng hệ thống gợi ý sản phẩm tự động dựa trên thói quen mua sắm, lịch sử tìm kiếm và danh mục quan tâm của khách hàng để hiển thị các đề xuất giày thể thao phù hợp nhất trên trang chi tiết sản phẩm.</w:t>
       </w:r>
@@ -44151,24 +44154,28 @@
     </w:p>
     <w:p>
       <w:pPr/>
+      <w:r/>
       <w:r>
         <w:t>2. ReactJS Official Documentation - https://react.dev/</w:t>
       </w:r>
     </w:p>
     <w:p>
       <w:pPr/>
+      <w:r/>
       <w:r>
         <w:t>3. Spring Security Reference Guide - https://docs.spring.io/spring-security/reference/index.html</w:t>
       </w:r>
     </w:p>
     <w:p>
       <w:pPr/>
+      <w:r/>
       <w:r>
         <w:t>4. MySQL Reference Manual - https://dev.mysql.com/doc/refman/8.0/en/</w:t>
       </w:r>
     </w:p>
     <w:p>
       <w:pPr/>
+      <w:r/>
       <w:r>
         <w:t>5. Axios HTTP Client Documentation - https://axios-http.com/docs/intro</w:t>
       </w:r>

</xml_diff>

<commit_message>
Add change position for banner management
</commit_message>
<xml_diff>
--- a/VuHoangChinh-2122110380.docx
+++ b/VuHoangChinh-2122110380.docx
@@ -44399,6 +44399,38 @@
       <w:r/>
       <w:r>
         <w:t>5. Mở thư mục frontendUI bằng Visual Studio Code, chạy lệnh npm install và npm run dev để khởi động Client Storefront (cổng 5173).</w:t>
+      </w:r>
+    </w:p>
+    <w:p>
+      <w:pPr>
+        <w:pStyle w:val="Heading2"/>
+      </w:pPr>
+      <w:r>
+        <w:t>Tính Năng Quản Lý Banner Nâng Cao (Smart Banner Management)</w:t>
+      </w:r>
+    </w:p>
+    <w:p>
+      <w:r>
+        <w:rPr>
+          <w:b/>
+        </w:rPr>
+        <w:t>Hệ thống quản trị (Admin Dashboard) đã được tích hợp module Quản lý Banner thông minh với các tính năng vượt trội nhằm tối ưu hóa trải nghiệm của người vận hành:</w:t>
+      </w:r>
+    </w:p>
+    <w:p>
+      <w:r>
+        <w:t xml:space="preserve">• Sắp Xếp Trực Quan Bằng Kéo Thả (Drag &amp; Drop): </w:t>
+      </w:r>
+      <w:r>
+        <w:t>Thay vì phải nhập số thứ tự thủ công một cách máy móc, người quản trị có thể trực tiếp dùng chuột kéo và thả (Drag &amp; Drop) các thẻ hình ảnh banner để thay đổi vị trí xuất hiện của chúng trên thanh trượt (slider) của trang chủ. Giao diện được thiết kế theo cơ chế Optimistic UI, phản hồi mượt mà ngay lập tức trước khi hệ thống đồng bộ ngầm toàn bộ dữ liệu vị trí (position) mới xuống Backend thông qua API Bulk Update.</w:t>
+      </w:r>
+    </w:p>
+    <w:p>
+      <w:r>
+        <w:t xml:space="preserve">• Bật/Tắt Nhanh (Quick Toggle Status): </w:t>
+      </w:r>
+      <w:r>
+        <w:t>Tại mỗi thẻ banner, hệ thống cung cấp một nút thao tác nhanh (biểu tượng con mắt) cho phép thay đổi trạng thái hiển thị (Active / Disable) ngay lập tức mà không cần chuyển hướng sang trang chỉnh sửa chi tiết. Khi một banner bị đưa về trạng thái vô hiệu hóa (Disable), hình ảnh đại diện của thẻ đó sẽ tự động chuyển sang màu xám (grayscale) và mờ đi, giúp người quản trị dễ dàng nhận biết trạng thái trực quan chỉ bằng một cái nhìn lướt qua.</w:t>
       </w:r>
     </w:p>
     <w:sectPr>

</xml_diff>

<commit_message>
Add change position banner
</commit_message>
<xml_diff>
--- a/VuHoangChinh-2122110380.docx
+++ b/VuHoangChinh-2122110380.docx
@@ -44419,10 +44419,10 @@
     </w:p>
     <w:p>
       <w:r>
-        <w:t xml:space="preserve">• Sắp Xếp Trực Quan Bằng Kéo Thả (Drag &amp; Drop): </w:t>
-      </w:r>
-      <w:r>
-        <w:t>Thay vì phải nhập số thứ tự thủ công một cách máy móc, người quản trị có thể trực tiếp dùng chuột kéo và thả (Drag &amp; Drop) các thẻ hình ảnh banner để thay đổi vị trí xuất hiện của chúng trên thanh trượt (slider) của trang chủ. Giao diện được thiết kế theo cơ chế Optimistic UI, phản hồi mượt mà ngay lập tức trước khi hệ thống đồng bộ ngầm toàn bộ dữ liệu vị trí (position) mới xuống Backend thông qua API Bulk Update.</w:t>
+        <w:t xml:space="preserve">• Hoán Đổi Không Gian Trực Tiếp (Live Swap Layout Animation): </w:t>
+      </w:r>
+      <w:r>
+        <w:t>Hệ thống được nâng cấp mạnh mẽ bằng bộ lõi @dnd-kit chuyên nghiệp. Khi người quản trị nhấc một thẻ banner và di chuyển đến vị trí của thẻ khác (ví dụ kéo banner vị trí số 1 sang vị trí số 4), các thẻ còn lại sẽ lập tức có hiệu ứng "trượt mượt mà" để nhường chỗ hoặc thế chỗ ngay thời gian thực (Live Animation). Trải nghiệm tương tác vật lý này đem lại cảm giác cực kỳ cao cấp ngang ngửa các hệ thống quản trị của MacOS. Dữ liệu sau đó sẽ được tự động đồng bộ ngầm xuống Backend thông qua API Bulk Update.</w:t>
       </w:r>
     </w:p>
     <w:p>
@@ -44430,7 +44430,7 @@
         <w:t xml:space="preserve">• Bật/Tắt Nhanh (Quick Toggle Status): </w:t>
       </w:r>
       <w:r>
-        <w:t>Tại mỗi thẻ banner, hệ thống cung cấp một nút thao tác nhanh (biểu tượng con mắt) cho phép thay đổi trạng thái hiển thị (Active / Disable) ngay lập tức mà không cần chuyển hướng sang trang chỉnh sửa chi tiết. Khi một banner bị đưa về trạng thái vô hiệu hóa (Disable), hình ảnh đại diện của thẻ đó sẽ tự động chuyển sang màu xám (grayscale) và mờ đi, giúp người quản trị dễ dàng nhận biết trạng thái trực quan chỉ bằng một cái nhìn lướt qua.</w:t>
+        <w:t>Tại mỗi thẻ banner, hệ thống cung cấp một nút thao tác nhanh cho phép thay đổi trạng thái hiển thị (Active / Disable) ngay lập tức. Khi một banner bị đưa về trạng thái vô hiệu hóa, hình ảnh đại diện của thẻ sẽ tự động chuyển sang màu xám (grayscale) và mờ đi, giúp quản trị viên dễ dàng nhận biết trạng thái trực quan chỉ bằng một cái nhìn lướt qua.</w:t>
       </w:r>
     </w:p>
     <w:sectPr>

</xml_diff>

<commit_message>
Fix error change position in banner managêmnt successfull
</commit_message>
<xml_diff>
--- a/VuHoangChinh-2122110380.docx
+++ b/VuHoangChinh-2122110380.docx
@@ -44431,6 +44431,14 @@
       </w:r>
       <w:r>
         <w:t>Tại mỗi thẻ banner, hệ thống cung cấp một nút thao tác nhanh cho phép thay đổi trạng thái hiển thị (Active / Disable) ngay lập tức. Khi một banner bị đưa về trạng thái vô hiệu hóa, hình ảnh đại diện của thẻ sẽ tự động chuyển sang màu xám (grayscale) và mờ đi, giúp quản trị viên dễ dàng nhận biết trạng thái trực quan chỉ bằng một cái nhìn lướt qua.</w:t>
+      </w:r>
+    </w:p>
+    <w:p>
+      <w:r>
+        <w:t xml:space="preserve">• Tự Động Tái Cấp Phát Vị Trí (Auto-sequencing State): </w:t>
+      </w:r>
+      <w:r>
+        <w:t>Hệ thống được trang bị cơ chế tự động theo dõi và lấp đầy các "lỗ hổng" dữ liệu. Khi quản trị viên thêm mới một banner (tự động gán vào cuối danh sách), hoặc xóa một banner bất kỳ ở giữa danh sách, Frontend sẽ ngay lập tức tính toán và dồn lại số thứ tự (position) của tất cả các banner còn lại nhằm đảm bảo tính liên tục 1, 2, 3... Ngay sau đó, một tiến trình cập nhật hàng loạt (Bulk Update) sẽ được thực thi ngầm để bảo toàn tính nhất quán tuyệt đối giữa Cơ sở dữ liệu và Giao diện UI, loại bỏ hoàn toàn các lỗi xung đột do trùng lặp vị trí.</w:t>
       </w:r>
     </w:p>
     <w:sectPr>

</xml_diff>

<commit_message>
Complete the article page, article details page, and product page
</commit_message>
<xml_diff>
--- a/VuHoangChinh-2122110380.docx
+++ b/VuHoangChinh-2122110380.docx
@@ -44722,6 +44722,83 @@
     <w:p>
       <w:r>
         <w:t>- Frontend (frontendUI): Tích hợp giao diện Bộ sưu tập ảnh (Gallery) trong trang Chi Tiết Sản Phẩm (Detail.jsx). Xây dựng cấu trúc CSS nâng cao: Hiệu ứng chuyển cảnh Fade-in mượt mà, Thumbnail Hover Scale chân thực, cùng thanh cuộn Custom Scrollbar mô phỏng chuẩn xác giao diện của các hệ thống E-commerce hiện đại.</w:t>
+      </w:r>
+    </w:p>
+    <w:p>
+      <w:r>
+        <w:br w:type="page"/>
+      </w:r>
+    </w:p>
+    <w:p>
+      <w:pPr>
+        <w:pStyle w:val="Heading1"/>
+      </w:pPr>
+      <w:r>
+        <w:t>PHẦN BỔ SUNG: NÂNG CẤP HỆ THỐNG VÀ ĐỒNG BỘ DỮ LIỆU FRONTEND</w:t>
+      </w:r>
+    </w:p>
+    <w:p>
+      <w:pPr>
+        <w:pStyle w:val="Heading2"/>
+      </w:pPr>
+      <w:r>
+        <w:t>1. Triển khai Cổng Tin tức / Blog và Khắc phục Tương thích API Phân trang</w:t>
+      </w:r>
+    </w:p>
+    <w:p>
+      <w:r>
+        <w:t>Để nâng cao hiệu quả tối ưu hóa công cụ tìm kiếm (SEO) và mang lại cẩm nang hướng dẫn chuyên sâu cho khách hàng, hệ thống đã tích hợp thêm phân hệ Tin tức / Blog hoàn chỉnh ở cả hai phía Backend và Store Frontend. Giao diện trang danh sách bài viết (/blog) được bố cục theo cấu trúc 2 cột hiện đại: Cột trái hiển thị danh mục chủ đề tin tức với hiệu ứng Glassmorphic, cột phải hiển thị lưới bài viết dạng thẻ (Post Card) kèm hình ảnh đại diện, chuyên mục và ngày đăng tin.</w:t>
+      </w:r>
+    </w:p>
+    <w:p>
+      <w:r>
+        <w:t>Đồng thời, hệ thống đã giải quyết triệt để lỗi không đồng nhất cấu trúc dữ liệu (Pagination Data Incompatibility) giữa Spring Boot và ReactJS. Cụ thể, phía Backend sử dụng cơ chế phân trang Spring Data JPA trả về đối tượng Page, trong đó mảng dữ liệu thực tế được đóng gói bên trong thuộc tính 'content'. Các thành phần hiển thị danh mục (ProductCategoryList, BlogCategoryList), tìm kiếm autocomplete tại Header, và các danh sách bài viết/sản phẩm đã được cấu hình lại để bóc tách mảng dữ liệu qua biểu thức an toàn 'data.content || data.Content || data || []'. Giải pháp này giúp loại bỏ hoàn toàn các lỗi sập giao diện React (TypeError) và khôi phục trạng thái hoạt động đồng bộ của toàn hệ thống.</w:t>
+      </w:r>
+    </w:p>
+    <w:p>
+      <w:pPr>
+        <w:pStyle w:val="Heading2"/>
+      </w:pPr>
+      <w:r>
+        <w:t>2. Nâng cấp Giao diện Chi tiết Sản phẩm Premium Glassmorphism</w:t>
+      </w:r>
+    </w:p>
+    <w:p>
+      <w:r>
+        <w:t>Trang chi tiết sản phẩm (ProductDetail.jsx) của Store Frontend đã được tái thiết kế và nâng cấp mạnh mẽ về UI/UX nhằm tạo ấn tượng chuyên nghiệp và thúc đẩy hành vi mua hàng của người dùng:</w:t>
+      </w:r>
+    </w:p>
+    <w:p>
+      <w:r>
+        <w:t>- Bảng điều khiển số lượng Capsule: Thay thế ô nhập số lượng dạng mặc định bằng một bộ chọn dạng con nhộng (Capsule) bo tròn mềm mại, có tích hợp các nút tăng giảm (+ / -) trực quan, giúp tối ưu hóa thao tác người dùng kể cả trên thiết bị di động.</w:t>
+      </w:r>
+    </w:p>
+    <w:p>
+      <w:r>
+        <w:t>- Chỉ báo tồn kho động (Live Stock Pulse Indicator): Cạnh chữ 'Còn hàng' được bổ sung một chấm tròn động màu xanh lá nhấp nháy liên tục (sử dụng thuộc tính CSS animation: pulse), tạo phản hồi thị giác sinh động về trạng thái sẵn có của hàng hóa.</w:t>
+      </w:r>
+    </w:p>
+    <w:p>
+      <w:r>
+        <w:t>- Thư viện ảnh thu nhỏ đối xứng (Centered Thumbnail Gallery): Phần danh sách ảnh phụ (thumbnails) đã được canh chỉnh chính giữa chính xác ngay phía dưới ảnh đại diện chính của sản phẩm thay vì bị lệch trái như trước đây. Layout đối xứng này kết hợp với các hiệu ứng hover-zoom giúp nâng tầm tính thẩm mỹ của trang chi tiết sản phẩm.</w:t>
+      </w:r>
+    </w:p>
+    <w:p>
+      <w:pPr>
+        <w:pStyle w:val="Heading2"/>
+      </w:pPr>
+      <w:r>
+        <w:t>3. Phát triển Bộ Lọc Nâng Cao &amp; Tìm Kiếm Động trang Cửa Hàng (/products)</w:t>
+      </w:r>
+    </w:p>
+    <w:p>
+      <w:r>
+        <w:t>Trang cửa hàng bán sản phẩm (/products) đã được tích hợp bộ lọc tìm kiếm nâng cao đa chiều (Multi-criteria Filtering). Hệ thống cho phép khách hàng thực hiện đồng thời các hành vi: lọc sản phẩm theo danh mục cụ thể ở sidebar, tìm kiếm theo từ khóa tên/mô tả sản phẩm, và thiết lập khoảng giá bán mong muốn.</w:t>
+      </w:r>
+    </w:p>
+    <w:p>
+      <w:r>
+        <w:t>Tại tầng cơ sở dữ liệu (Backend), phương thức filterProducts trong ProductRepository đã được thiết lập sử dụng câu lệnh JPQL tùy chỉnh thông minh, tích hợp cú pháp logic ':param IS NULL' để bỏ qua các tham số lọc nếu người dùng không nhập vào. Bộ lọc khoảng giá bán thực tế được so sánh chuẩn xác thông qua hàm COALESCE(p.discountPrice, p.basePrice), đảm bảo kết quả chính xác đối với cả sản phẩm đang giảm giá lẫn sản phẩm bán theo giá niêm yết gốc. Dữ liệu trả về được phân trang Pageable nghiêm ngặt (tối đa 8 sản phẩm/trang) giúp tối ưu tài nguyên mạng và cải thiện vượt trội tốc độ tải trang.</w:t>
       </w:r>
     </w:p>
     <w:sectPr>

</xml_diff>

<commit_message>
Add grid view and list view in post, custommer
</commit_message>
<xml_diff>
--- a/VuHoangChinh-2122110380.docx
+++ b/VuHoangChinh-2122110380.docx
@@ -44799,6 +44799,60 @@
     <w:p>
       <w:r>
         <w:t>Tại tầng cơ sở dữ liệu (Backend), phương thức filterProducts trong ProductRepository đã được thiết lập sử dụng câu lệnh JPQL tùy chỉnh thông minh, tích hợp cú pháp logic ':param IS NULL' để bỏ qua các tham số lọc nếu người dùng không nhập vào. Bộ lọc khoảng giá bán thực tế được so sánh chuẩn xác thông qua hàm COALESCE(p.discountPrice, p.basePrice), đảm bảo kết quả chính xác đối với cả sản phẩm đang giảm giá lẫn sản phẩm bán theo giá niêm yết gốc. Dữ liệu trả về được phân trang Pageable nghiêm ngặt (tối đa 8 sản phẩm/trang) giúp tối ưu tài nguyên mạng và cải thiện vượt trội tốc độ tải trang.</w:t>
+      </w:r>
+    </w:p>
+    <w:p>
+      <w:pPr>
+        <w:pStyle w:val="Heading2"/>
+      </w:pPr>
+      <w:r>
+        <w:t>Quản Lý Biến Thể Sản Phẩm Thông Minh (Intelligent Variant Management)</w:t>
+      </w:r>
+    </w:p>
+    <w:p>
+      <w:r>
+        <w:t>Nhằm đáp ứng nghiệp vụ thương mại điện tử chuyên nghiệp, hệ thống đã được nâng cấp với tính năng quản lý biến thể nâng cao. Mỗi sản phẩm có thể có nhiều biến thể dựa trên tổ hợp Kích cỡ (Size) và Màu sắc (Color). Đặc biệt, hệ thống hỗ trợ trường dữ liệu Giá khuyến mãi (Sale Price) hoạt động độc lập trên từng biến thể, cho phép ban quản trị xả kho hoặc chạy chiến dịch giảm giá riêng biệt cho từng màu sắc/kích cỡ (ví dụ: Giày màu Trắng bán chậm có thể giảm giá sâu hơn màu Đen).</w:t>
+      </w:r>
+    </w:p>
+    <w:p>
+      <w:pPr>
+        <w:jc w:val="center"/>
+      </w:pPr>
+      <w:r>
+        <w:rPr>
+          <w:b/>
+          <w:color w:val="FF0000"/>
+        </w:rPr>
+        <w:t>[CHỖ TRỐNG CẦN THÊM ẢNH 1: Chụp màn hình bảng giao diện danh sách Biến thể (Variants) có hiện cột "Sale Price" và "Base Price" trên Admin Dashboard]</w:t>
+      </w:r>
+    </w:p>
+    <w:p>
+      <w:r>
+        <w:t>Bên cạnh đó, việc khởi tạo thủ công hàng chục biến thể (ví dụ 4 Sizes x 3 Colors = 12 dòng) gây lãng phí thời gian và làm giảm trải nghiệm người dùng (UX). Để giải quyết vấn đề này, tính năng Bulk Generate (Khởi tạo hàng loạt) đã được phát triển. Quản trị viên chỉ cần nhập các giá trị kích cỡ và màu sắc cách nhau bằng dấu phẩy, điền giá và số lượng mặc định. Hệ thống sẽ tự động thực hiện phép nhân chéo (Cartesian product) để sinh ra toàn bộ danh sách biến thể trong chưa tới 1 giây.</w:t>
+      </w:r>
+    </w:p>
+    <w:p>
+      <w:pPr>
+        <w:jc w:val="center"/>
+      </w:pPr>
+      <w:r>
+        <w:rPr>
+          <w:b/>
+          <w:color w:val="FF0000"/>
+        </w:rPr>
+        <w:t>[CHỖ TRỐNG CẦN THÊM ẢNH 2: Chụp màn hình đang mở phần "Bulk Generate" điền sẵn các Size "39, 40, 41" và Color "Red, Blue" trước khi bấm nút Generate]</w:t>
+      </w:r>
+    </w:p>
+    <w:p>
+      <w:pPr>
+        <w:jc w:val="center"/>
+      </w:pPr>
+      <w:r>
+        <w:rPr>
+          <w:b/>
+          <w:color w:val="FF0000"/>
+        </w:rPr>
+        <w:t>[CHỖ TRỐNG CẦN THÊM ẢNH 3: Chụp màn hình lúc hệ thống tự động chạy ra danh sách biến thể siêu tốc sau khi bấm nút Generate]</w:t>
       </w:r>
     </w:p>
     <w:sectPr>

</xml_diff>

<commit_message>
Add management img for variant
</commit_message>
<xml_diff>
--- a/VuHoangChinh-2122110380.docx
+++ b/VuHoangChinh-2122110380.docx
@@ -45471,7 +45471,7 @@
     </w:p>
     <w:p>
       <w:r>
-        <w:t>Nhằm đáp ứng nghiệp vụ thương mại điện tử chuyên nghiệp, hệ thống đã được nâng cấp với tính năng quản lý biến thể nâng cao. Mỗi sản phẩm có thể có nhiều biến thể dựa trên tổ hợp Kích cỡ (Size) và Màu sắc (Color). Đặc biệt, hệ thống hỗ trợ trường dữ liệu Giá khuyến mãi (Sale Price) hoạt động độc lập trên từng biến thể, cho phép ban quản trị xả kho hoặc chạy chiến dịch giảm giá riêng biệt cho từng màu sắc/kích cỡ (ví dụ: Giày màu Trắng bán chậm có thể giảm giá sâu hơn màu Đen).</w:t>
+        <w:t>Nhằm đáp ứng nghiệp vụ thương mại điện tử chuyên nghiệp, hệ thống đã được nâng cấp với tính năng quản lý biến thể nâng cao. Mỗi sản phẩm có thể có nhiều biến thể dựa trên tổ hợp Kích cỡ (Size) và Màu sắc (Color). Đặc biệt, hệ thống hỗ trợ trường dữ liệu Giá khuyến mãi (Sale Price) hoạt động độc lập trên từng biến thể, cho phép ban quản trị xả kho hoặc chạy chiến dịch giảm giá riêng biệt cho từng màu sắc/kích cỡ. Để tối giản hóa giao diện quản lý biến thể, cột 'Image' (Hình ảnh) rườm rà trước đây trong bảng biến thể đã được loại bỏ hoàn toàn; thay vào đó, hệ thống hỗ trợ trình chọn ảnh theo nhóm màu sắc (Color Groups) trực quan ngay tại form sản phẩm chính giúp tự động đồng bộ ảnh cho các biến thể cùng màu.</w:t>
       </w:r>
     </w:p>
     <w:p>
@@ -45479,11 +45479,7 @@
         <w:jc w:val="center"/>
       </w:pPr>
       <w:r>
-        <w:rPr>
-          <w:b/>
-          <w:color w:val="FF0000"/>
-        </w:rPr>
-        <w:t>[CHỖ TRỐNG CẦN THÊM ẢNH 1: Chụp màn hình bảng giao diện danh sách Biến thể (Variants) có hiện cột "Sale Price" và "Base Price" trên Admin Dashboard]</w:t>
+        <w:t>[CHỖ TRỐNG CẦN THÊM ẢNH 1: Chụp màn hình bảng giao diện danh sách Biến thể (Variants) đã loại bỏ cột Image và có hiện cột "Sale Price" và "Base Price" trên Admin Dashboard]</w:t>
       </w:r>
     </w:p>
     <w:p>

</xml_diff>

<commit_message>
At AI chatbot into frontend
</commit_message>
<xml_diff>
--- a/VuHoangChinh-2122110380.docx
+++ b/VuHoangChinh-2122110380.docx
@@ -45587,6 +45587,46 @@
     <w:p>
       <w:r>
         <w:t>[CHỖ TRỐNG CẦN THÊM ẢNH 8: Chụp màn hình Modal xem thông tin Staff (UserViewModal) hiển thị danh sách các bài viết do nhân sự đó đã tạo]</w:t>
+      </w:r>
+    </w:p>
+    <w:p>
+      <w:pPr>
+        <w:pStyle w:val="Heading2"/>
+      </w:pPr>
+      <w:r>
+        <w:t>8. Tích hợp Trợ lý AI Bán hàng (AI Chatbot) và Tối ưu hóa UI/UX</w:t>
+      </w:r>
+    </w:p>
+    <w:p>
+      <w:r>
+        <w:rPr>
+          <w:b/>
+        </w:rPr>
+        <w:t>Hệ thống cửa hàng giày thể thao Chinh Hoops đã được nâng cấp tích hợp thành công Trợ lý AI Bán hàng (AI Sales Assistant) sử dụng kỹ thuật RAG (Retrieval-Augmented Generation) kết hợp giữa CSDL Vector cục bộ và mô hình ngôn ngữ lớn:</w:t>
+      </w:r>
+    </w:p>
+    <w:p>
+      <w:r>
+        <w:t xml:space="preserve">• Kiến trúc RAG và Đồng bộ Dữ liệu: </w:t>
+      </w:r>
+      <w:r>
+        <w:t>Server AI được xây dựng độc lập bằng Python FastAPI (chạy cổng 8000), sử dụng ChromaDB làm cơ sở dữ liệu Vector lưu trữ thông tin sản phẩm và kết nối trực tiếp đến mô hình Google Gemini 3.5 Flash thông qua SDK google-genai mới nhất. Khi Admin thực hiện CRUD sản phẩm tại Backend Java, hệ thống sẽ tự động gửi yêu cầu đồng bộ bất đồng bộ (Asynchronous Sync) sang FastAPI để cập nhật ChromaDB thời gian thực.</w:t>
+      </w:r>
+    </w:p>
+    <w:p>
+      <w:r>
+        <w:t xml:space="preserve">• Tối ưu hóa Hiệu năng Backend (Non-Blocking): </w:t>
+      </w:r>
+      <w:r>
+        <w:t>Để khắc phục tình trạng nghẽn Event Loop của FastAPI khi ChromaDB thực hiện tính toán vector embedding và truy vấn trên CPU (mất khoảng 1-2 giây), hệ thống áp dụng kỹ thuật bọc hàm truy vấn trong asyncio.to_thread. Điều này giúp chạy tác vụ trong một luồng riêng biệt (Thread Pool), giải phóng Event Loop chính của FastAPI để xử lý các kết nối khác song song, tăng tốc độ phản hồi đáng kể.</w:t>
+      </w:r>
+    </w:p>
+    <w:p>
+      <w:r>
+        <w:t xml:space="preserve">• Thiết kế UI/UX Màu Cam Thương Hiệu và Hiệu ứng Bouncing: </w:t>
+      </w:r>
+      <w:r>
+        <w:t>Khung chat Widget (ChatWidget.jsx) được định tuyến ở mức Router toàn cục của ReactJS, tránh bị che khuất bởi các container trang con. Giao diện được thiết kế theo phong cách Glassmorphism với tông màu cam chủ đạo (#f97316, #ea580c) đồng bộ với nhận diện thương hiệu Chinh Hoops. Vị trí khung chat được tinh chỉnh cố định sát góc phải bên dưới (bottom: 24px) khi mở rộng, khắc phục lỗi lệch vị trí tạo khoảng trống lớn. Ngoài ra, ba dấu chấm biểu thị đang gõ chữ được thiết kế hiệu ứng nhảy lên xuống nhịp nhàng (bouncing dots animation) thay vì nhấp nháy mờ tắt đơn thuần, đem lại trải nghiệm cao cấp giống các dịch vụ chat hàng đầu.</w:t>
       </w:r>
     </w:p>
     <w:sectPr>

</xml_diff>

<commit_message>
Backup before improve UX in managemant product
</commit_message>
<xml_diff>
--- a/VuHoangChinh-2122110380.docx
+++ b/VuHoangChinh-2122110380.docx
@@ -45615,18 +45615,42 @@
     </w:p>
     <w:p>
       <w:r>
-        <w:t xml:space="preserve">• Tối ưu hóa Hiệu năng Backend (Non-Blocking): </w:t>
-      </w:r>
-      <w:r>
-        <w:t>Để khắc phục tình trạng nghẽn Event Loop của FastAPI khi ChromaDB thực hiện tính toán vector embedding và truy vấn trên CPU (mất khoảng 1-2 giây), hệ thống áp dụng kỹ thuật bọc hàm truy vấn trong asyncio.to_thread. Điều này giúp chạy tác vụ trong một luồng riêng biệt (Thread Pool), giải phóng Event Loop chính của FastAPI để xử lý các kết nối khác song song, tăng tốc độ phản hồi đáng kể.</w:t>
+        <w:t xml:space="preserve">• Nâng cấp RAG đa chiều &amp; Đồng bộ Biến thể: </w:t>
+      </w:r>
+      <w:r>
+        <w:t>Để hỗ trợ AI trả lời các câu hỏi chi tiết về từng biến thể sản phẩm, hệ thống đã mở rộng cấu hình đồng bộ hóa. Bên cạnh thông tin cơ bản, dữ liệu chuyển giao sang ChromaDB giờ đây bao gồm: giá bán gốc (basePrice), giá khuyến mãi (discountPrice), tính toán số tiền tiết kiệm và danh sách toàn bộ các biến thể cụ thể (kích cỡ size, màu sắc color, số lượng tồn kho thực tế của từng size/màu). AI có thể tra cứu và đưa ra tư vấn chính xác size giày hay màu sắc còn hay hết hàng trực tiếp dựa trên dữ liệu cập nhật.</w:t>
       </w:r>
     </w:p>
     <w:p>
       <w:r>
+        <w:t xml:space="preserve">• Tự động đánh nhãn Sản phẩm Bán chạy (Best Seller): </w:t>
+      </w:r>
+      <w:r>
+        <w:t>FastAPI Server được bổ sung logic tự động gọi API /best-sellers từ Java Backend để nhận diện 5 sản phẩm bán chạy nhất hệ thống. AI tự động gắn nhãn đặc điểm nổi bật "Sản phẩm bán chạy nhất (Best Seller) tại cửa hàng Chinh Hoops" vào tài liệu tri thức ChromaDB, giúp trợ lý AI nhanh chóng gợi ý các mẫu giày hot nhất khi khách hàng yêu cầu tư vấn.</w:t>
+      </w:r>
+    </w:p>
+    <w:p>
+      <w:r>
+        <w:t xml:space="preserve">• Tối ưu hóa Hiệu năng Backend (Non-Blocking): </w:t>
+      </w:r>
+      <w:r>
+        <w:t>Để khắc phục tình trạng nghẽn Event Loop của FastAPI khi ChromaDB thực hiện tính toán vector embedding và truy vấn trên CPU (mất khoảng 1-2 giây), hệ thống áp dụng kỹ thuật bọc hàm truy vấn trong asyncio.to_thread. Điều này giúp chạy tác vụ trong một luồng riêng biệt (Thread Pool), giải phóng Event Loop chính của FastAPI để xử lý các kết nối khác song song, tăng tốc độ phản hồi đáng kể.</w:t>
+      </w:r>
+    </w:p>
+    <w:p>
+      <w:r>
         <w:t xml:space="preserve">• Thiết kế UI/UX Màu Cam Thương Hiệu và Hiệu ứng Bouncing: </w:t>
       </w:r>
       <w:r>
-        <w:t>Khung chat Widget (ChatWidget.jsx) được định tuyến ở mức Router toàn cục của ReactJS, tránh bị che khuất bởi các container trang con. Giao diện được thiết kế theo phong cách Glassmorphism với tông màu cam chủ đạo (#f97316, #ea580c) đồng bộ với nhận diện thương hiệu Chinh Hoops. Vị trí khung chat được tinh chỉnh cố định sát góc phải bên dưới (bottom: 24px) khi mở rộng, khắc phục lỗi lệch vị trí tạo khoảng trống lớn. Ngoài ra, ba dấu chấm biểu thị đang gõ chữ được thiết kế hiệu ứng nhảy lên xuống nhịp nhàng (bouncing dots animation) thay vì nhấp nháy mờ tắt đơn thuần, đem lại trải nghiệm cao cấp giống các dịch vụ chat hàng đầu.</w:t>
+        <w:t>Khung chat Widget (ChatWidget.jsx) được định tuyến ở mức Router toàn cục của ReactJS, tránh bị che khuất bởi các container trang con. Giao diện được thiết kế theo phong cách Glassmorphism với tông màu cam chủ đạo (#f97316, #ea580c) đồng bộ với nhận diện thương hiệu Chinh Hoops. Vị trí khung chat được tinh chỉnh cố định sát góc phải bên dưới (bottom: 24px) khi mở rộng. Mã CSS được tách rời hoàn toàn sang tệp độc lập ChatWidget.css với bình luận chi tiết. Ngoài ra, ba dấu chấm biểu thị đang gõ chữ được thiết kế hiệu ứng nhảy lên xuống nhịp nhàng (bouncing dots animation), đem lại trải nghiệm cao cấp.</w:t>
+      </w:r>
+    </w:p>
+    <w:p>
+      <w:r>
+        <w:t xml:space="preserve">• Khắc phục lỗi cuộn trang (Auto-scroll UX): </w:t>
+      </w:r>
+      <w:r>
+        <w:t>Khắc phục triệt để lỗi trải nghiệm cuộn khi khách hàng thu nhỏ và mở lại khung chat. Trạng thái đóng mở isOpen đã được đưa vào danh sách phụ thuộc của React Effect và trì hoãn khoảng 60ms để đảm bảo DOM render hoàn thiện trước khi tự động cuộn (scrollIntoView) mượt mà tới tin nhắn gần nhất dưới cùng.</w:t>
       </w:r>
     </w:p>
     <w:sectPr>

</xml_diff>